<commit_message>
Checkpoint: Final reports generated in Downloads and Assist Plus button branding updated before adding Jurisdiction Switch
</commit_message>
<xml_diff>
--- a/SIH26045_IP_SAKTI_Sahayak_Comprehensive_Project_Report.docx
+++ b/SIH26045_IP_SAKTI_Sahayak_Comprehensive_Project_Report.docx
@@ -4714,7 +4714,7 @@
           <w:color w:val="B45309"/>
           <w:sz w:val="27"/>
         </w:rPr>
-        <w:t>Aspect 10: Dedicated IP &amp; Statutory Document Generation Suite</w:t>
+        <w:t>Aspect 10: Dedicated IP &amp; Statutory Document Generation Suite &amp; Assist Plus Workspace</w:t>
       </w:r>
     </w:p>
     <w:p>
@@ -4727,7 +4727,7 @@
           <w:color w:val="1E293B"/>
           <w:sz w:val="21"/>
         </w:rPr>
-        <w:t>The application includes a dedicated 'Document Drafting Center' capable of generating ready-to-file legal drafts:</w:t>
+        <w:t>The application includes an executive 'Assist Plus Workspace' and document drafting suite capable of generating ready-to-file legal drafts:</w:t>
         <w:br/>
         <w:t>• Patent Form 1: Application for Grant of Patent</w:t>
         <w:br/>
@@ -4738,6 +4738,8 @@
         <w:t>• Form 158-B Compliance Dossier: State Ayush Licensing checklist for classical and proprietary medicines</w:t>
         <w:br/>
         <w:t>• Patient &amp; Innovator Legal Disclosures: Voluntary informed consent and benefit-sharing declarations.</w:t>
+        <w:br/>
+        <w:t>• Assist Plus 6-Stage Milestone Roadmap: Dynamic statutory milestone tracking and verified Ministry of Ayush mentorship advisory.</w:t>
       </w:r>
     </w:p>
     <w:p>

</xml_diff>